<commit_message>
implemented multihop for URLs
</commit_message>
<xml_diff>
--- a/Tests/RAG1-Test.docx
+++ b/Tests/RAG1-Test.docx
@@ -11,9 +11,12 @@
           <w:rPr>
             <w:rStyle w:val="Hyperlink"/>
           </w:rPr>
-          <w:t xml:space="preserve"> https://engineering-computer-science.wright.edu/computer-science-and-engineering</w:t>
+          <w:t>https://catalog.wright.edu/preview_program.php?poid=23088&amp;catoid=25</w:t>
         </w:r>
       </w:hyperlink>
+      <w:r>
+        <w:t xml:space="preserve"> </w:t>
+      </w:r>
     </w:p>
     <w:tbl>
       <w:tblPr>

</xml_diff>